<commit_message>
Creación del dashboard exclusivo para clientes (hay que hacer ciertos cambios dentro de el)
</commit_message>
<xml_diff>
--- a/docs/1 Informe Técnico del Proyecto.docx
+++ b/docs/1 Informe Técnico del Proyecto.docx
@@ -1,6 +1,6 @@
 
 <file path=word/document.xml><?xml version="1.0" encoding="utf-8"?>
-<w:document xmlns:wpc="http://schemas.microsoft.com/office/word/2010/wordprocessingCanvas" xmlns:cx="http://schemas.microsoft.com/office/drawing/2014/chartex" xmlns:cx1="http://schemas.microsoft.com/office/drawing/2015/9/8/chartex" xmlns:cx2="http://schemas.microsoft.com/office/drawing/2015/10/21/chartex" xmlns:cx3="http://schemas.microsoft.com/office/drawing/2016/5/9/chartex" xmlns:cx4="http://schemas.microsoft.com/office/drawing/2016/5/10/chartex" xmlns:cx5="http://schemas.microsoft.com/office/drawing/2016/5/11/chartex" xmlns:cx6="http://schemas.microsoft.com/office/drawing/2016/5/12/chartex" xmlns:cx7="http://schemas.microsoft.com/office/drawing/2016/5/13/chartex" xmlns:cx8="http://schemas.microsoft.com/office/drawing/2016/5/14/chartex" xmlns:mc="http://schemas.openxmlformats.org/markup-compatibility/2006" xmlns:aink="http://schemas.microsoft.com/office/drawing/2016/ink" xmlns:am3d="http://schemas.microsoft.com/office/drawing/2017/model3d" xmlns:o="urn:schemas-microsoft-com:office:office" xmlns:r="http://schemas.openxmlformats.org/officeDocument/2006/relationships" xmlns:m="http://schemas.openxmlformats.org/officeDocument/2006/math" xmlns:v="urn:schemas-microsoft-com:vml" xmlns:wp14="http://schemas.microsoft.com/office/word/2010/wordprocessingDrawing" xmlns:wp="http://schemas.openxmlformats.org/drawingml/2006/wordprocessingDrawing" xmlns:w10="urn:schemas-microsoft-com:office:word" xmlns:w="http://schemas.openxmlformats.org/wordprocessingml/2006/main" xmlns:w14="http://schemas.microsoft.com/office/word/2010/wordml" xmlns:w15="http://schemas.microsoft.com/office/word/2012/wordml" xmlns:w16cid="http://schemas.microsoft.com/office/word/2016/wordml/cid" xmlns:w16se="http://schemas.microsoft.com/office/word/2015/wordml/symex" xmlns:wpg="http://schemas.microsoft.com/office/word/2010/wordprocessingGroup" xmlns:wpi="http://schemas.microsoft.com/office/word/2010/wordprocessingInk" xmlns:wne="http://schemas.microsoft.com/office/word/2006/wordml" xmlns:wps="http://schemas.microsoft.com/office/word/2010/wordprocessingShape" mc:Ignorable="w14 w15 w16se w16cid wp14">
+<w:document xmlns:wpc="http://schemas.microsoft.com/office/word/2010/wordprocessingCanvas" xmlns:cx="http://schemas.microsoft.com/office/drawing/2014/chartex" xmlns:cx1="http://schemas.microsoft.com/office/drawing/2015/9/8/chartex" xmlns:cx2="http://schemas.microsoft.com/office/drawing/2015/10/21/chartex" xmlns:cx3="http://schemas.microsoft.com/office/drawing/2016/5/9/chartex" xmlns:cx4="http://schemas.microsoft.com/office/drawing/2016/5/10/chartex" xmlns:cx5="http://schemas.microsoft.com/office/drawing/2016/5/11/chartex" xmlns:cx6="http://schemas.microsoft.com/office/drawing/2016/5/12/chartex" xmlns:cx7="http://schemas.microsoft.com/office/drawing/2016/5/13/chartex" xmlns:cx8="http://schemas.microsoft.com/office/drawing/2016/5/14/chartex" xmlns:mc="http://schemas.openxmlformats.org/markup-compatibility/2006" xmlns:aink="http://schemas.microsoft.com/office/drawing/2016/ink" xmlns:am3d="http://schemas.microsoft.com/office/drawing/2017/model3d" xmlns:o="urn:schemas-microsoft-com:office:office" xmlns:oel="http://schemas.microsoft.com/office/2019/extlst" xmlns:r="http://schemas.openxmlformats.org/officeDocument/2006/relationships" xmlns:m="http://schemas.openxmlformats.org/officeDocument/2006/math" xmlns:v="urn:schemas-microsoft-com:vml" xmlns:wp14="http://schemas.microsoft.com/office/word/2010/wordprocessingDrawing" xmlns:wp="http://schemas.openxmlformats.org/drawingml/2006/wordprocessingDrawing" xmlns:w10="urn:schemas-microsoft-com:office:word" xmlns:w="http://schemas.openxmlformats.org/wordprocessingml/2006/main" xmlns:w14="http://schemas.microsoft.com/office/word/2010/wordml" xmlns:w15="http://schemas.microsoft.com/office/word/2012/wordml" xmlns:w16cex="http://schemas.microsoft.com/office/word/2018/wordml/cex" xmlns:w16cid="http://schemas.microsoft.com/office/word/2016/wordml/cid" xmlns:w16="http://schemas.microsoft.com/office/word/2018/wordml" xmlns:w16du="http://schemas.microsoft.com/office/word/2023/wordml/word16du" xmlns:w16sdtdh="http://schemas.microsoft.com/office/word/2020/wordml/sdtdatahash" xmlns:w16sdtfl="http://schemas.microsoft.com/office/word/2024/wordml/sdtformatlock" xmlns:w16se="http://schemas.microsoft.com/office/word/2015/wordml/symex" xmlns:wpg="http://schemas.microsoft.com/office/word/2010/wordprocessingGroup" xmlns:wpi="http://schemas.microsoft.com/office/word/2010/wordprocessingInk" xmlns:wne="http://schemas.microsoft.com/office/word/2006/wordml" xmlns:wps="http://schemas.microsoft.com/office/word/2010/wordprocessingShape" mc:Ignorable="w14 w15 w16se w16cid w16 w16cex w16sdtdh w16sdtfl w16du wp14">
   <w:body>
     <w:p>
       <w:pPr>
@@ -67,40 +67,22 @@
         <w:ind w:left="2" w:right="136"/>
       </w:pPr>
       <w:r>
-        <w:t xml:space="preserve">El </w:t>
-      </w:r>
-      <w:proofErr w:type="gramStart"/>
-      <w:r>
-        <w:t xml:space="preserve">presente </w:t>
-      </w:r>
-      <w:r>
-        <w:t xml:space="preserve"> documento</w:t>
-      </w:r>
-      <w:proofErr w:type="gramEnd"/>
-      <w:r>
-        <w:t xml:space="preserve"> detalla el desarrollo de una aplicación web para la pizzería Benedetto, ubicada en Sincelejo, Sucre. La aplicación se ha construido utilizando</w:t>
+        <w:t xml:space="preserve">El presente </w:t>
+      </w:r>
+      <w:r>
+        <w:t xml:space="preserve"> documento detalla el desarrollo de una aplicación web para la pizzería Benedetto, ubicada en</w:t>
+      </w:r>
+      <w:r>
+        <w:t xml:space="preserve"> la ciudad de</w:t>
+      </w:r>
+      <w:r>
+        <w:t xml:space="preserve"> Sincelejo, Sucre. La aplicación se ha construido utilizando</w:t>
       </w:r>
       <w:r>
         <w:t xml:space="preserve"> principalmente</w:t>
       </w:r>
       <w:r>
-        <w:t xml:space="preserve"> Python con </w:t>
-      </w:r>
-      <w:proofErr w:type="spellStart"/>
-      <w:r>
-        <w:t>Flask</w:t>
-      </w:r>
-      <w:proofErr w:type="spellEnd"/>
-      <w:r>
-        <w:t xml:space="preserve">, Jinja2 y </w:t>
-      </w:r>
-      <w:proofErr w:type="spellStart"/>
-      <w:r>
-        <w:t>Tailwind</w:t>
-      </w:r>
-      <w:proofErr w:type="spellEnd"/>
-      <w:r>
-        <w:t xml:space="preserve"> CSS </w:t>
+        <w:t xml:space="preserve"> Python con Flask, Jinja2 y Tailwind CSS </w:t>
       </w:r>
       <w:r>
         <w:t xml:space="preserve">V </w:t>
@@ -112,24 +94,11 @@
         <w:t>.0</w:t>
       </w:r>
       <w:r>
-        <w:t xml:space="preserve"> para el </w:t>
-      </w:r>
-      <w:proofErr w:type="spellStart"/>
-      <w:r>
-        <w:t>frontend</w:t>
-      </w:r>
-      <w:proofErr w:type="spellEnd"/>
-      <w:r>
-        <w:t>, y una base de datos MySQL</w:t>
-      </w:r>
-      <w:r>
-        <w:t xml:space="preserve"> implementada mediante </w:t>
-      </w:r>
-      <w:proofErr w:type="spellStart"/>
-      <w:r>
-        <w:t>Flask-Sqlalchemy</w:t>
-      </w:r>
-      <w:proofErr w:type="spellEnd"/>
+        <w:t xml:space="preserve"> para el frontend, y una base de datos MySQL</w:t>
+      </w:r>
+      <w:r>
+        <w:t xml:space="preserve"> implementada mediante Flask-Sqlalchemy</w:t>
+      </w:r>
       <w:r>
         <w:t>. Se describirán las etapas del proyecto, desde la concepción hasta la implementación y pruebas del sistema.</w:t>
       </w:r>
@@ -577,21 +546,7 @@
         <w:rPr>
           <w:szCs w:val="22"/>
         </w:rPr>
-        <w:t xml:space="preserve">Desarrollar una aplicación web que mejore la gestión interna de Benedetto Pizza, la interacción con sus clientes y su presencia online, permitiendo a la empresa ser </w:t>
-      </w:r>
-      <w:proofErr w:type="spellStart"/>
-      <w:r>
-        <w:rPr>
-          <w:szCs w:val="22"/>
-        </w:rPr>
-        <w:t>mas</w:t>
-      </w:r>
-      <w:proofErr w:type="spellEnd"/>
-      <w:r>
-        <w:rPr>
-          <w:szCs w:val="22"/>
-        </w:rPr>
-        <w:t xml:space="preserve"> competitiva.</w:t>
+        <w:t>Desarrollar una aplicación web que mejore la gestión interna de Benedetto Pizza, la interacción con sus clientes y su presencia online, permitiendo a la empresa ser mas competitiva.</w:t>
       </w:r>
     </w:p>
     <w:p>
@@ -721,8 +676,6 @@
         </w:rPr>
         <w:t xml:space="preserve">segura </w:t>
       </w:r>
-      <w:bookmarkStart w:id="0" w:name="_GoBack"/>
-      <w:bookmarkEnd w:id="0"/>
       <w:r>
         <w:rPr>
           <w:sz w:val="24"/>
@@ -893,39 +846,7 @@
         </w:numPr>
       </w:pPr>
       <w:r>
-        <w:t xml:space="preserve">Gestión de clientes (CRUD - </w:t>
-      </w:r>
-      <w:proofErr w:type="spellStart"/>
-      <w:r>
-        <w:t>Create</w:t>
-      </w:r>
-      <w:proofErr w:type="spellEnd"/>
-      <w:r>
-        <w:t xml:space="preserve">, </w:t>
-      </w:r>
-      <w:proofErr w:type="spellStart"/>
-      <w:r>
-        <w:t>Read</w:t>
-      </w:r>
-      <w:proofErr w:type="spellEnd"/>
-      <w:r>
-        <w:t xml:space="preserve">, </w:t>
-      </w:r>
-      <w:proofErr w:type="spellStart"/>
-      <w:r>
-        <w:t>Update</w:t>
-      </w:r>
-      <w:proofErr w:type="spellEnd"/>
-      <w:r>
-        <w:t xml:space="preserve">, </w:t>
-      </w:r>
-      <w:proofErr w:type="spellStart"/>
-      <w:r>
-        <w:t>Delete</w:t>
-      </w:r>
-      <w:proofErr w:type="spellEnd"/>
-      <w:r>
-        <w:t>).</w:t>
+        <w:t>Gestión de clientes (CRUD - Create, Read, Update, Delete).</w:t>
       </w:r>
     </w:p>
     <w:p>
@@ -997,15 +918,7 @@
         </w:numPr>
       </w:pPr>
       <w:r>
-        <w:t>Sistema de autenticación y autorización (</w:t>
-      </w:r>
-      <w:proofErr w:type="spellStart"/>
-      <w:r>
-        <w:t>Flask-Login</w:t>
-      </w:r>
-      <w:proofErr w:type="spellEnd"/>
-      <w:r>
-        <w:t>).</w:t>
+        <w:t>Sistema de autenticación y autorización (Flask-Login).</w:t>
       </w:r>
     </w:p>
     <w:p>
@@ -1818,21 +1731,7 @@
         <w:rPr>
           <w:sz w:val="24"/>
         </w:rPr>
-        <w:t xml:space="preserve">Interfaz web desarrollada con Jinja2 y </w:t>
-      </w:r>
-      <w:proofErr w:type="spellStart"/>
-      <w:r>
-        <w:rPr>
-          <w:sz w:val="24"/>
-        </w:rPr>
-        <w:t>Tailwind</w:t>
-      </w:r>
-      <w:proofErr w:type="spellEnd"/>
-      <w:r>
-        <w:rPr>
-          <w:sz w:val="24"/>
-        </w:rPr>
-        <w:t xml:space="preserve"> CSS v4.</w:t>
+        <w:t>Interfaz web desarrollada con Jinja2 y Tailwind CSS v4.</w:t>
       </w:r>
     </w:p>
     <w:p>
@@ -2057,13 +1956,8 @@
         </w:numPr>
         <w:spacing w:before="4"/>
       </w:pPr>
-      <w:proofErr w:type="spellStart"/>
-      <w:r>
-        <w:t>Dashboard</w:t>
-      </w:r>
-      <w:proofErr w:type="spellEnd"/>
-      <w:r>
-        <w:t xml:space="preserve"> (panel de control) </w:t>
+      <w:r>
+        <w:t xml:space="preserve">Dashboard (panel de control) </w:t>
       </w:r>
     </w:p>
     <w:p>
@@ -2076,39 +1970,7 @@
         <w:spacing w:before="4"/>
       </w:pPr>
       <w:r>
-        <w:t xml:space="preserve">Gestión de clientes (lista y formularios CRUD - </w:t>
-      </w:r>
-      <w:proofErr w:type="spellStart"/>
-      <w:r>
-        <w:t>Create</w:t>
-      </w:r>
-      <w:proofErr w:type="spellEnd"/>
-      <w:r>
-        <w:t xml:space="preserve">, </w:t>
-      </w:r>
-      <w:proofErr w:type="spellStart"/>
-      <w:r>
-        <w:t>Read</w:t>
-      </w:r>
-      <w:proofErr w:type="spellEnd"/>
-      <w:r>
-        <w:t xml:space="preserve">, </w:t>
-      </w:r>
-      <w:proofErr w:type="spellStart"/>
-      <w:r>
-        <w:t>Update</w:t>
-      </w:r>
-      <w:proofErr w:type="spellEnd"/>
-      <w:r>
-        <w:t xml:space="preserve">, </w:t>
-      </w:r>
-      <w:proofErr w:type="spellStart"/>
-      <w:r>
-        <w:t>Delete</w:t>
-      </w:r>
-      <w:proofErr w:type="spellEnd"/>
-      <w:r>
-        <w:t xml:space="preserve">) </w:t>
+        <w:t xml:space="preserve">Gestión de clientes (lista y formularios CRUD - Create, Read, Update, Delete) </w:t>
       </w:r>
     </w:p>
     <w:p>
@@ -2183,15 +2045,7 @@
         <w:t>en desarrollo</w:t>
       </w:r>
       <w:r>
-        <w:t xml:space="preserve">) (no incluye la funcionalidad completa de la venta, pero el registro de la misma </w:t>
-      </w:r>
-      <w:proofErr w:type="spellStart"/>
-      <w:r>
-        <w:t>si</w:t>
-      </w:r>
-      <w:proofErr w:type="spellEnd"/>
-      <w:r>
-        <w:t>).</w:t>
+        <w:t>) (no incluye la funcionalidad completa de la venta, pero el registro de la misma si).</w:t>
       </w:r>
     </w:p>
     <w:p>
@@ -2206,15 +2060,7 @@
         <w:spacing w:before="5"/>
       </w:pPr>
       <w:r>
-        <w:t xml:space="preserve">Se utilizó </w:t>
-      </w:r>
-      <w:proofErr w:type="spellStart"/>
-      <w:r>
-        <w:t>Tailwind</w:t>
-      </w:r>
-      <w:proofErr w:type="spellEnd"/>
-      <w:r>
-        <w:t xml:space="preserve"> CSS v4 para el diseño de las interfaces</w:t>
+        <w:t>Se utilizó Tailwind CSS v4 para el diseño de las interfaces</w:t>
       </w:r>
       <w:r>
         <w:t>, en conjunto con Jinja2</w:t>
@@ -2282,7 +2128,7 @@
           <w:noProof/>
         </w:rPr>
         <w:drawing>
-          <wp:inline distT="0" distB="0" distL="0" distR="0" wp14:anchorId="205FA0F3" wp14:editId="0FAE5F06">
+          <wp:inline distT="0" distB="0" distL="0" distR="0" wp14:anchorId="0B65427E" wp14:editId="58BDEFC8">
             <wp:extent cx="5403850" cy="4131603"/>
             <wp:effectExtent l="0" t="0" r="0" b="0"/>
             <wp:docPr id="6" name="Imagen 6" descr="C:\Users\USUARIO\AppData\Local\Microsoft\Windows\INetCache\Content.MSO\3A541CDB.tmp"/>
@@ -2801,21 +2647,12 @@
           <w:sz w:val="24"/>
         </w:rPr>
       </w:pPr>
-      <w:proofErr w:type="spellStart"/>
       <w:r>
         <w:rPr>
           <w:b/>
           <w:sz w:val="24"/>
         </w:rPr>
-        <w:t>Backend</w:t>
-      </w:r>
-      <w:proofErr w:type="spellEnd"/>
-      <w:r>
-        <w:rPr>
-          <w:b/>
-          <w:sz w:val="24"/>
-        </w:rPr>
-        <w:t>:</w:t>
+        <w:t>Backend:</w:t>
       </w:r>
       <w:r>
         <w:rPr>
@@ -2843,23 +2680,7 @@
           <w:spacing w:val="-2"/>
           <w:sz w:val="24"/>
         </w:rPr>
-        <w:t>(</w:t>
-      </w:r>
-      <w:proofErr w:type="spellStart"/>
-      <w:r>
-        <w:rPr>
-          <w:spacing w:val="-2"/>
-          <w:sz w:val="24"/>
-        </w:rPr>
-        <w:t>Flask</w:t>
-      </w:r>
-      <w:proofErr w:type="spellEnd"/>
-      <w:r>
-        <w:rPr>
-          <w:spacing w:val="-2"/>
-          <w:sz w:val="24"/>
-        </w:rPr>
-        <w:t xml:space="preserve">) </w:t>
+        <w:t xml:space="preserve">(Flask) </w:t>
       </w:r>
       <w:r>
         <w:rPr>
@@ -2868,201 +2689,11 @@
         </w:rPr>
         <w:t xml:space="preserve">Módulos: </w:t>
       </w:r>
-      <w:proofErr w:type="spellStart"/>
-      <w:r>
-        <w:rPr>
-          <w:sz w:val="24"/>
-        </w:rPr>
-        <w:t>Cryptography</w:t>
-      </w:r>
-      <w:proofErr w:type="spellEnd"/>
-      <w:r>
-        <w:rPr>
-          <w:sz w:val="24"/>
-        </w:rPr>
-        <w:t xml:space="preserve">, </w:t>
-      </w:r>
-      <w:proofErr w:type="spellStart"/>
-      <w:r>
-        <w:rPr>
-          <w:sz w:val="24"/>
-        </w:rPr>
-        <w:t>dnspython</w:t>
-      </w:r>
-      <w:proofErr w:type="spellEnd"/>
-      <w:r>
-        <w:rPr>
-          <w:sz w:val="24"/>
-        </w:rPr>
-        <w:t xml:space="preserve">, </w:t>
-      </w:r>
-      <w:proofErr w:type="spellStart"/>
-      <w:r>
-        <w:rPr>
-          <w:sz w:val="24"/>
-        </w:rPr>
-        <w:t>email_validator</w:t>
-      </w:r>
-      <w:proofErr w:type="spellEnd"/>
-      <w:r>
-        <w:rPr>
-          <w:sz w:val="24"/>
-        </w:rPr>
-        <w:t xml:space="preserve">, </w:t>
-      </w:r>
-      <w:proofErr w:type="spellStart"/>
-      <w:r>
-        <w:rPr>
-          <w:sz w:val="24"/>
-        </w:rPr>
-        <w:t>Flask</w:t>
-      </w:r>
-      <w:proofErr w:type="spellEnd"/>
-      <w:r>
-        <w:rPr>
-          <w:sz w:val="24"/>
-        </w:rPr>
-        <w:t xml:space="preserve">, </w:t>
-      </w:r>
-      <w:proofErr w:type="spellStart"/>
-      <w:r>
-        <w:rPr>
-          <w:sz w:val="24"/>
-        </w:rPr>
-        <w:t>flask-cors</w:t>
-      </w:r>
-      <w:proofErr w:type="spellEnd"/>
-      <w:r>
-        <w:rPr>
-          <w:sz w:val="24"/>
-        </w:rPr>
-        <w:t xml:space="preserve">, </w:t>
-      </w:r>
-      <w:proofErr w:type="spellStart"/>
-      <w:r>
-        <w:rPr>
-          <w:sz w:val="24"/>
-        </w:rPr>
-        <w:t>Flask-DotEnv</w:t>
-      </w:r>
-      <w:proofErr w:type="spellEnd"/>
-      <w:r>
-        <w:rPr>
-          <w:sz w:val="24"/>
-        </w:rPr>
-        <w:t xml:space="preserve">, </w:t>
-      </w:r>
-      <w:proofErr w:type="spellStart"/>
-      <w:r>
-        <w:rPr>
-          <w:sz w:val="24"/>
-        </w:rPr>
-        <w:t>Flask-Login</w:t>
-      </w:r>
-      <w:proofErr w:type="spellEnd"/>
-      <w:r>
-        <w:rPr>
-          <w:sz w:val="24"/>
-        </w:rPr>
-        <w:t xml:space="preserve">, </w:t>
-      </w:r>
-      <w:proofErr w:type="spellStart"/>
-      <w:r>
-        <w:rPr>
-          <w:sz w:val="24"/>
-        </w:rPr>
-        <w:t>Flask-SQLAlchemy</w:t>
-      </w:r>
-      <w:proofErr w:type="spellEnd"/>
-      <w:r>
-        <w:rPr>
-          <w:sz w:val="24"/>
-        </w:rPr>
-        <w:t xml:space="preserve">, Jinja2, </w:t>
-      </w:r>
-      <w:proofErr w:type="spellStart"/>
-      <w:r>
-        <w:rPr>
-          <w:sz w:val="24"/>
-        </w:rPr>
-        <w:t>MarkupSafe</w:t>
-      </w:r>
-      <w:proofErr w:type="spellEnd"/>
-      <w:r>
-        <w:rPr>
-          <w:sz w:val="24"/>
-        </w:rPr>
-        <w:t xml:space="preserve">, </w:t>
-      </w:r>
-      <w:proofErr w:type="spellStart"/>
-      <w:r>
-        <w:rPr>
-          <w:sz w:val="24"/>
-        </w:rPr>
-        <w:t>pydantic</w:t>
-      </w:r>
-      <w:proofErr w:type="spellEnd"/>
-      <w:r>
-        <w:rPr>
-          <w:sz w:val="24"/>
-        </w:rPr>
-        <w:t xml:space="preserve">, </w:t>
-      </w:r>
-      <w:proofErr w:type="spellStart"/>
-      <w:r>
-        <w:rPr>
-          <w:sz w:val="24"/>
-        </w:rPr>
-        <w:t>PyMySQL</w:t>
-      </w:r>
-      <w:proofErr w:type="spellEnd"/>
-      <w:r>
-        <w:rPr>
-          <w:sz w:val="24"/>
-        </w:rPr>
-        <w:t xml:space="preserve">, </w:t>
-      </w:r>
-      <w:proofErr w:type="spellStart"/>
-      <w:r>
-        <w:rPr>
-          <w:sz w:val="24"/>
-        </w:rPr>
-        <w:t>python-dotenv</w:t>
-      </w:r>
-      <w:proofErr w:type="spellEnd"/>
-      <w:r>
-        <w:rPr>
-          <w:sz w:val="24"/>
-        </w:rPr>
-        <w:t xml:space="preserve">, </w:t>
-      </w:r>
-      <w:proofErr w:type="spellStart"/>
-      <w:r>
-        <w:rPr>
-          <w:sz w:val="24"/>
-        </w:rPr>
-        <w:t>SQLAlchemy</w:t>
-      </w:r>
-      <w:proofErr w:type="spellEnd"/>
-      <w:r>
-        <w:rPr>
-          <w:sz w:val="24"/>
-        </w:rPr>
-        <w:t xml:space="preserve"> </w:t>
-      </w:r>
-      <w:proofErr w:type="spellStart"/>
-      <w:r>
-        <w:rPr>
-          <w:sz w:val="24"/>
-        </w:rPr>
-        <w:t>Werkzeug</w:t>
-      </w:r>
-      <w:proofErr w:type="spellEnd"/>
-      <w:r>
-        <w:rPr>
-          <w:sz w:val="24"/>
-        </w:rPr>
-        <w:t>.</w:t>
+      <w:r>
+        <w:rPr>
+          <w:sz w:val="24"/>
+        </w:rPr>
+        <w:t>Cryptography, dnspython, email_validator, Flask, flask-cors, Flask-DotEnv, Flask-Login, Flask-SQLAlchemy, Jinja2, MarkupSafe, pydantic, PyMySQL, python-dotenv, SQLAlchemy Werkzeug.</w:t>
       </w:r>
     </w:p>
     <w:p>
@@ -3080,21 +2711,12 @@
           <w:sz w:val="24"/>
         </w:rPr>
       </w:pPr>
-      <w:proofErr w:type="spellStart"/>
       <w:r>
         <w:rPr>
           <w:b/>
           <w:sz w:val="24"/>
         </w:rPr>
-        <w:t>Frontend</w:t>
-      </w:r>
-      <w:proofErr w:type="spellEnd"/>
-      <w:r>
-        <w:rPr>
-          <w:b/>
-          <w:sz w:val="24"/>
-        </w:rPr>
-        <w:t>:</w:t>
+        <w:t>Frontend:</w:t>
       </w:r>
       <w:r>
         <w:rPr>
@@ -3325,17 +2947,8 @@
           <w:spacing w:val="-2"/>
           <w:sz w:val="24"/>
         </w:rPr>
-        <w:t>GitHub-</w:t>
-      </w:r>
-      <w:proofErr w:type="spellStart"/>
-      <w:r>
-        <w:rPr>
-          <w:spacing w:val="-2"/>
-          <w:sz w:val="24"/>
-        </w:rPr>
-        <w:t>Projects</w:t>
-      </w:r>
-      <w:proofErr w:type="spellEnd"/>
+        <w:t>GitHub-Projects</w:t>
+      </w:r>
     </w:p>
     <w:p>
       <w:pPr>
@@ -3531,19 +3144,11 @@
         </w:rPr>
         <w:t xml:space="preserve"> </w:t>
       </w:r>
-      <w:proofErr w:type="spellStart"/>
-      <w:r>
-        <w:rPr>
-          <w:highlight w:val="yellow"/>
-        </w:rPr>
-        <w:t>Flask</w:t>
-      </w:r>
-      <w:proofErr w:type="spellEnd"/>
-      <w:r>
-        <w:rPr>
-          <w:highlight w:val="yellow"/>
-        </w:rPr>
-        <w:t xml:space="preserve">. </w:t>
+      <w:r>
+        <w:rPr>
+          <w:highlight w:val="yellow"/>
+        </w:rPr>
+        <w:t xml:space="preserve">Flask. </w:t>
       </w:r>
       <w:r>
         <w:rPr>
@@ -3570,97 +3175,11 @@
           <w:highlight w:val="yellow"/>
         </w:rPr>
       </w:pPr>
-      <w:proofErr w:type="spellStart"/>
-      <w:r>
-        <w:rPr>
-          <w:highlight w:val="yellow"/>
-        </w:rPr>
-        <w:t>tree</w:t>
-      </w:r>
-      <w:proofErr w:type="spellEnd"/>
-      <w:r>
-        <w:rPr>
-          <w:highlight w:val="yellow"/>
-        </w:rPr>
-        <w:t xml:space="preserve"> /F /A | </w:t>
-      </w:r>
-      <w:proofErr w:type="spellStart"/>
-      <w:r>
-        <w:rPr>
-          <w:highlight w:val="yellow"/>
-        </w:rPr>
-        <w:t>findstr</w:t>
-      </w:r>
-      <w:proofErr w:type="spellEnd"/>
-      <w:r>
-        <w:rPr>
-          <w:highlight w:val="yellow"/>
-        </w:rPr>
-        <w:t xml:space="preserve"> /V "\</w:t>
-      </w:r>
-      <w:proofErr w:type="spellStart"/>
-      <w:r>
-        <w:rPr>
-          <w:highlight w:val="yellow"/>
-        </w:rPr>
-        <w:t>node_modules</w:t>
-      </w:r>
-      <w:proofErr w:type="spellEnd"/>
-      <w:r>
-        <w:rPr>
-          <w:highlight w:val="yellow"/>
-        </w:rPr>
-        <w:t>\ __</w:t>
-      </w:r>
-      <w:proofErr w:type="spellStart"/>
-      <w:r>
-        <w:rPr>
-          <w:highlight w:val="yellow"/>
-        </w:rPr>
-        <w:t>pycache</w:t>
-      </w:r>
-      <w:proofErr w:type="spellEnd"/>
-      <w:r>
-        <w:rPr>
-          <w:highlight w:val="yellow"/>
-        </w:rPr>
-        <w:t>__</w:t>
-      </w:r>
-      <w:proofErr w:type="gramStart"/>
-      <w:r>
-        <w:rPr>
-          <w:highlight w:val="yellow"/>
-        </w:rPr>
-        <w:t>\ .</w:t>
-      </w:r>
-      <w:proofErr w:type="spellStart"/>
-      <w:r>
-        <w:rPr>
-          <w:highlight w:val="yellow"/>
-        </w:rPr>
-        <w:t>git</w:t>
-      </w:r>
-      <w:proofErr w:type="spellEnd"/>
-      <w:proofErr w:type="gramEnd"/>
-      <w:r>
-        <w:rPr>
-          <w:highlight w:val="yellow"/>
-        </w:rPr>
-        <w:t>\ .</w:t>
-      </w:r>
-      <w:proofErr w:type="spellStart"/>
-      <w:r>
-        <w:rPr>
-          <w:highlight w:val="yellow"/>
-        </w:rPr>
-        <w:t>env</w:t>
-      </w:r>
-      <w:proofErr w:type="spellEnd"/>
-      <w:r>
-        <w:rPr>
-          <w:highlight w:val="yellow"/>
-        </w:rPr>
-        <w:t>"</w:t>
+      <w:r>
+        <w:rPr>
+          <w:highlight w:val="yellow"/>
+        </w:rPr>
+        <w:t>tree /F /A | findstr /V "\node_modules\ __pycache__\ .git\ .env"</w:t>
       </w:r>
     </w:p>
     <w:p>
@@ -3707,18 +3226,8 @@
           <w:sz w:val="20"/>
           <w:highlight w:val="yellow"/>
         </w:rPr>
-        <w:t>/</w:t>
-      </w:r>
-      <w:proofErr w:type="spellStart"/>
-      <w:r>
-        <w:rPr>
-          <w:rFonts w:ascii="Courier New" w:hAnsi="Courier New"/>
-          <w:sz w:val="20"/>
-          <w:highlight w:val="yellow"/>
-        </w:rPr>
-        <w:t>static</w:t>
-      </w:r>
-      <w:proofErr w:type="spellEnd"/>
+        <w:t>/static</w:t>
+      </w:r>
       <w:r>
         <w:rPr>
           <w:rFonts w:ascii="Courier New" w:hAnsi="Courier New"/>
@@ -3788,18 +3297,8 @@
           <w:sz w:val="20"/>
           <w:highlight w:val="yellow"/>
         </w:rPr>
-        <w:t>/</w:t>
-      </w:r>
-      <w:proofErr w:type="spellStart"/>
-      <w:r>
-        <w:rPr>
-          <w:rFonts w:ascii="Courier New"/>
-          <w:sz w:val="20"/>
-          <w:highlight w:val="yellow"/>
-        </w:rPr>
-        <w:t>templates</w:t>
-      </w:r>
-      <w:proofErr w:type="spellEnd"/>
+        <w:t>/templates</w:t>
+      </w:r>
       <w:r>
         <w:rPr>
           <w:rFonts w:ascii="Courier New"/>
@@ -3835,18 +3334,8 @@
           <w:sz w:val="20"/>
           <w:highlight w:val="yellow"/>
         </w:rPr>
-        <w:t>/</w:t>
-      </w:r>
-      <w:proofErr w:type="spellStart"/>
-      <w:r>
-        <w:rPr>
-          <w:rFonts w:ascii="Courier New"/>
-          <w:sz w:val="20"/>
-          <w:highlight w:val="yellow"/>
-        </w:rPr>
-        <w:t>routes</w:t>
-      </w:r>
-      <w:proofErr w:type="spellEnd"/>
+        <w:t>/routes</w:t>
+      </w:r>
       <w:r>
         <w:rPr>
           <w:rFonts w:ascii="Courier New"/>
@@ -3914,18 +3403,8 @@
           <w:sz w:val="20"/>
           <w:highlight w:val="yellow"/>
         </w:rPr>
-        <w:t>/</w:t>
-      </w:r>
-      <w:proofErr w:type="spellStart"/>
-      <w:r>
-        <w:rPr>
-          <w:rFonts w:ascii="Courier New" w:hAnsi="Courier New"/>
-          <w:sz w:val="20"/>
-          <w:highlight w:val="yellow"/>
-        </w:rPr>
-        <w:t>models</w:t>
-      </w:r>
-      <w:proofErr w:type="spellEnd"/>
+        <w:t>/models</w:t>
+      </w:r>
       <w:r>
         <w:rPr>
           <w:rFonts w:ascii="Courier New" w:hAnsi="Courier New"/>
@@ -4091,13 +3570,8 @@
         </w:numPr>
         <w:spacing w:before="3"/>
       </w:pPr>
-      <w:proofErr w:type="spellStart"/>
-      <w:r>
-        <w:t>Flask-Login</w:t>
-      </w:r>
-      <w:proofErr w:type="spellEnd"/>
-      <w:r>
-        <w:t>: Gestión de sesiones y roles.</w:t>
+      <w:r>
+        <w:t>Flask-Login: Gestión de sesiones y roles.</w:t>
       </w:r>
     </w:p>
     <w:p>
@@ -4110,15 +3584,7 @@
         <w:spacing w:before="3"/>
       </w:pPr>
       <w:r>
-        <w:t xml:space="preserve">Validación de correos: </w:t>
-      </w:r>
-      <w:proofErr w:type="spellStart"/>
-      <w:r>
-        <w:t>email_validator</w:t>
-      </w:r>
-      <w:proofErr w:type="spellEnd"/>
-      <w:r>
-        <w:t>.</w:t>
+        <w:t>Validación de correos: email_validator.</w:t>
       </w:r>
     </w:p>
     <w:p>
@@ -4131,13 +3597,8 @@
         <w:spacing w:before="3"/>
       </w:pPr>
       <w:r>
-        <w:t xml:space="preserve">Protección contra inyecciones SQL utilizando </w:t>
-      </w:r>
-      <w:proofErr w:type="spellStart"/>
-      <w:r>
-        <w:t>SQLAlchemy</w:t>
-      </w:r>
-      <w:proofErr w:type="spellEnd"/>
+        <w:t>Protección contra inyecciones SQL utilizando SQLAlchemy</w:t>
+      </w:r>
       <w:r>
         <w:t>.</w:t>
       </w:r>
@@ -4219,15 +3680,7 @@
         </w:numPr>
       </w:pPr>
       <w:r>
-        <w:t xml:space="preserve">Registro e inicio de sesión: Implementado usando </w:t>
-      </w:r>
-      <w:proofErr w:type="spellStart"/>
-      <w:r>
-        <w:t>Flask-Login</w:t>
-      </w:r>
-      <w:proofErr w:type="spellEnd"/>
-      <w:r>
-        <w:t>, con validación de formularios.</w:t>
+        <w:t>Registro e inicio de sesión: Implementado usando Flask-Login, con validación de formularios.</w:t>
       </w:r>
     </w:p>
     <w:p>
@@ -4287,15 +3740,7 @@
         </w:numPr>
       </w:pPr>
       <w:r>
-        <w:t xml:space="preserve">Landing Page: Implementada con </w:t>
-      </w:r>
-      <w:proofErr w:type="spellStart"/>
-      <w:r>
-        <w:t>Tailwind</w:t>
-      </w:r>
-      <w:proofErr w:type="spellEnd"/>
-      <w:r>
-        <w:t xml:space="preserve"> CSS y Jinja2, proporcionando información de la empresa, menú, testimonios, contacto.</w:t>
+        <w:t>Landing Page: Implementada con Tailwind CSS y Jinja2, proporcionando información de la empresa, menú, testimonios, contacto.</w:t>
       </w:r>
     </w:p>
     <w:p>
@@ -4589,15 +4034,7 @@
         <w:spacing w:before="280"/>
       </w:pPr>
       <w:r>
-        <w:t>Evaluación de la usabilidad de la interfaz en diferentes dispositivos (</w:t>
-      </w:r>
-      <w:proofErr w:type="spellStart"/>
-      <w:r>
-        <w:t>responsividad</w:t>
-      </w:r>
-      <w:proofErr w:type="spellEnd"/>
-      <w:r>
-        <w:t>).</w:t>
+        <w:t>Evaluación de la usabilidad de la interfaz en diferentes dispositivos (responsividad).</w:t>
       </w:r>
     </w:p>
     <w:p>
@@ -4973,21 +4410,12 @@
         </w:rPr>
         <w:t xml:space="preserve">plataformas como </w:t>
       </w:r>
-      <w:proofErr w:type="spellStart"/>
       <w:r>
         <w:rPr>
           <w:b/>
           <w:highlight w:val="yellow"/>
         </w:rPr>
-        <w:t>Heroku</w:t>
-      </w:r>
-      <w:proofErr w:type="spellEnd"/>
-      <w:r>
-        <w:rPr>
-          <w:b/>
-          <w:highlight w:val="yellow"/>
-        </w:rPr>
-        <w:t>, AWS o un VPS</w:t>
+        <w:t>Heroku, AWS o un VPS</w:t>
       </w:r>
       <w:r>
         <w:rPr>
@@ -5074,15 +4502,7 @@
         </w:numPr>
       </w:pPr>
       <w:r>
-        <w:t>Crear un entorno virtual de Python (</w:t>
-      </w:r>
-      <w:proofErr w:type="spellStart"/>
-      <w:r>
-        <w:t>venv</w:t>
-      </w:r>
-      <w:proofErr w:type="spellEnd"/>
-      <w:r>
-        <w:t>).</w:t>
+        <w:t>Crear un entorno virtual de Python (venv).</w:t>
       </w:r>
     </w:p>
     <w:p>
@@ -5130,15 +4550,7 @@
         </w:numPr>
       </w:pPr>
       <w:r>
-        <w:t xml:space="preserve">Ejecutar la aplicación </w:t>
-      </w:r>
-      <w:proofErr w:type="spellStart"/>
-      <w:r>
-        <w:t>Flask</w:t>
-      </w:r>
-      <w:proofErr w:type="spellEnd"/>
-      <w:r>
-        <w:t>.</w:t>
+        <w:t>Ejecutar la aplicación Flask.</w:t>
       </w:r>
     </w:p>
     <w:p>
@@ -5372,23 +4784,7 @@
         <w:ind w:left="2" w:right="136"/>
       </w:pPr>
       <w:r>
-        <w:t xml:space="preserve">Integración con sistemas de envío (ej. </w:t>
-      </w:r>
-      <w:proofErr w:type="spellStart"/>
-      <w:r>
-        <w:t>Rappi</w:t>
-      </w:r>
-      <w:proofErr w:type="spellEnd"/>
-      <w:r>
-        <w:t xml:space="preserve">, Uber </w:t>
-      </w:r>
-      <w:proofErr w:type="spellStart"/>
-      <w:r>
-        <w:t>Eats</w:t>
-      </w:r>
-      <w:proofErr w:type="spellEnd"/>
-      <w:r>
-        <w:t>).</w:t>
+        <w:t>Integración con sistemas de envío (ej. Rappi, Uber Eats).</w:t>
       </w:r>
     </w:p>
     <w:p>
@@ -5469,15 +4865,7 @@
         <w:ind w:right="136"/>
       </w:pPr>
       <w:r>
-        <w:t xml:space="preserve">Documentación oficial de </w:t>
-      </w:r>
-      <w:proofErr w:type="spellStart"/>
-      <w:r>
-        <w:t>Flask</w:t>
-      </w:r>
-      <w:proofErr w:type="spellEnd"/>
-      <w:r>
-        <w:t>: https://flask.palletsprojects.com/</w:t>
+        <w:t>Documentación oficial de Flask: https://flask.palletsprojects.com/</w:t>
       </w:r>
     </w:p>
     <w:p>
@@ -5490,15 +4878,7 @@
         <w:ind w:right="136"/>
       </w:pPr>
       <w:r>
-        <w:t xml:space="preserve">Documentación oficial de </w:t>
-      </w:r>
-      <w:proofErr w:type="spellStart"/>
-      <w:r>
-        <w:t>SQLAlchemy</w:t>
-      </w:r>
-      <w:proofErr w:type="spellEnd"/>
-      <w:r>
-        <w:t>: https://www.sqlalchemy.org/</w:t>
+        <w:t>Documentación oficial de SQLAlchemy: https://www.sqlalchemy.org/</w:t>
       </w:r>
     </w:p>
     <w:p>
@@ -5524,15 +4904,7 @@
         <w:ind w:right="136"/>
       </w:pPr>
       <w:r>
-        <w:t xml:space="preserve">Documentación oficial de </w:t>
-      </w:r>
-      <w:proofErr w:type="spellStart"/>
-      <w:r>
-        <w:t>Tailwind</w:t>
-      </w:r>
-      <w:proofErr w:type="spellEnd"/>
-      <w:r>
-        <w:t xml:space="preserve"> CSS: https://tailwindcss.com/docs</w:t>
+        <w:t>Documentación oficial de Tailwind CSS: https://tailwindcss.com/docs</w:t>
       </w:r>
     </w:p>
     <w:p/>
@@ -5547,7 +4919,7 @@
 </file>
 
 <file path=word/numbering.xml><?xml version="1.0" encoding="utf-8"?>
-<w:numbering xmlns:wpc="http://schemas.microsoft.com/office/word/2010/wordprocessingCanvas" xmlns:cx="http://schemas.microsoft.com/office/drawing/2014/chartex" xmlns:cx1="http://schemas.microsoft.com/office/drawing/2015/9/8/chartex" xmlns:cx2="http://schemas.microsoft.com/office/drawing/2015/10/21/chartex" xmlns:cx3="http://schemas.microsoft.com/office/drawing/2016/5/9/chartex" xmlns:cx4="http://schemas.microsoft.com/office/drawing/2016/5/10/chartex" xmlns:cx5="http://schemas.microsoft.com/office/drawing/2016/5/11/chartex" xmlns:cx6="http://schemas.microsoft.com/office/drawing/2016/5/12/chartex" xmlns:cx7="http://schemas.microsoft.com/office/drawing/2016/5/13/chartex" xmlns:cx8="http://schemas.microsoft.com/office/drawing/2016/5/14/chartex" xmlns:mc="http://schemas.openxmlformats.org/markup-compatibility/2006" xmlns:aink="http://schemas.microsoft.com/office/drawing/2016/ink" xmlns:am3d="http://schemas.microsoft.com/office/drawing/2017/model3d" xmlns:o="urn:schemas-microsoft-com:office:office" xmlns:r="http://schemas.openxmlformats.org/officeDocument/2006/relationships" xmlns:m="http://schemas.openxmlformats.org/officeDocument/2006/math" xmlns:v="urn:schemas-microsoft-com:vml" xmlns:wp14="http://schemas.microsoft.com/office/word/2010/wordprocessingDrawing" xmlns:wp="http://schemas.openxmlformats.org/drawingml/2006/wordprocessingDrawing" xmlns:w10="urn:schemas-microsoft-com:office:word" xmlns:w="http://schemas.openxmlformats.org/wordprocessingml/2006/main" xmlns:w14="http://schemas.microsoft.com/office/word/2010/wordml" xmlns:w15="http://schemas.microsoft.com/office/word/2012/wordml" xmlns:w16cid="http://schemas.microsoft.com/office/word/2016/wordml/cid" xmlns:w16se="http://schemas.microsoft.com/office/word/2015/wordml/symex" xmlns:wpg="http://schemas.microsoft.com/office/word/2010/wordprocessingGroup" xmlns:wpi="http://schemas.microsoft.com/office/word/2010/wordprocessingInk" xmlns:wne="http://schemas.microsoft.com/office/word/2006/wordml" xmlns:wps="http://schemas.microsoft.com/office/word/2010/wordprocessingShape" mc:Ignorable="w14 w15 w16se w16cid wp14">
+<w:numbering xmlns:wpc="http://schemas.microsoft.com/office/word/2010/wordprocessingCanvas" xmlns:cx="http://schemas.microsoft.com/office/drawing/2014/chartex" xmlns:cx1="http://schemas.microsoft.com/office/drawing/2015/9/8/chartex" xmlns:cx2="http://schemas.microsoft.com/office/drawing/2015/10/21/chartex" xmlns:cx3="http://schemas.microsoft.com/office/drawing/2016/5/9/chartex" xmlns:cx4="http://schemas.microsoft.com/office/drawing/2016/5/10/chartex" xmlns:cx5="http://schemas.microsoft.com/office/drawing/2016/5/11/chartex" xmlns:cx6="http://schemas.microsoft.com/office/drawing/2016/5/12/chartex" xmlns:cx7="http://schemas.microsoft.com/office/drawing/2016/5/13/chartex" xmlns:cx8="http://schemas.microsoft.com/office/drawing/2016/5/14/chartex" xmlns:mc="http://schemas.openxmlformats.org/markup-compatibility/2006" xmlns:aink="http://schemas.microsoft.com/office/drawing/2016/ink" xmlns:am3d="http://schemas.microsoft.com/office/drawing/2017/model3d" xmlns:o="urn:schemas-microsoft-com:office:office" xmlns:oel="http://schemas.microsoft.com/office/2019/extlst" xmlns:r="http://schemas.openxmlformats.org/officeDocument/2006/relationships" xmlns:m="http://schemas.openxmlformats.org/officeDocument/2006/math" xmlns:v="urn:schemas-microsoft-com:vml" xmlns:wp14="http://schemas.microsoft.com/office/word/2010/wordprocessingDrawing" xmlns:wp="http://schemas.openxmlformats.org/drawingml/2006/wordprocessingDrawing" xmlns:w10="urn:schemas-microsoft-com:office:word" xmlns:w="http://schemas.openxmlformats.org/wordprocessingml/2006/main" xmlns:w14="http://schemas.microsoft.com/office/word/2010/wordml" xmlns:w15="http://schemas.microsoft.com/office/word/2012/wordml" xmlns:w16cex="http://schemas.microsoft.com/office/word/2018/wordml/cex" xmlns:w16cid="http://schemas.microsoft.com/office/word/2016/wordml/cid" xmlns:w16="http://schemas.microsoft.com/office/word/2018/wordml" xmlns:w16du="http://schemas.microsoft.com/office/word/2023/wordml/word16du" xmlns:w16sdtdh="http://schemas.microsoft.com/office/word/2020/wordml/sdtdatahash" xmlns:w16sdtfl="http://schemas.microsoft.com/office/word/2024/wordml/sdtformatlock" xmlns:w16se="http://schemas.microsoft.com/office/word/2015/wordml/symex" xmlns:wpg="http://schemas.microsoft.com/office/word/2010/wordprocessingGroup" xmlns:wpi="http://schemas.microsoft.com/office/word/2010/wordprocessingInk" xmlns:wne="http://schemas.microsoft.com/office/word/2006/wordml" xmlns:wps="http://schemas.microsoft.com/office/word/2010/wordprocessingShape" mc:Ignorable="w14 w15 w16se w16cid w16 w16cex w16sdtdh w16sdtfl w16du wp14">
   <w:abstractNum w:abstractNumId="0" w15:restartNumberingAfterBreak="0">
     <w:nsid w:val="0ABD21FB"/>
     <w:multiLevelType w:val="hybridMultilevel"/>
@@ -7318,56 +6690,56 @@
       </w:pPr>
     </w:lvl>
   </w:abstractNum>
-  <w:num w:numId="1">
+  <w:num w:numId="1" w16cid:durableId="1265531716">
     <w:abstractNumId w:val="4"/>
   </w:num>
-  <w:num w:numId="2">
+  <w:num w:numId="2" w16cid:durableId="726031909">
     <w:abstractNumId w:val="11"/>
   </w:num>
-  <w:num w:numId="3">
+  <w:num w:numId="3" w16cid:durableId="1848212319">
     <w:abstractNumId w:val="5"/>
   </w:num>
-  <w:num w:numId="4">
+  <w:num w:numId="4" w16cid:durableId="1266963772">
     <w:abstractNumId w:val="12"/>
   </w:num>
-  <w:num w:numId="5">
+  <w:num w:numId="5" w16cid:durableId="176776581">
     <w:abstractNumId w:val="6"/>
   </w:num>
-  <w:num w:numId="6">
+  <w:num w:numId="6" w16cid:durableId="1542857542">
     <w:abstractNumId w:val="2"/>
   </w:num>
-  <w:num w:numId="7">
+  <w:num w:numId="7" w16cid:durableId="365182816">
     <w:abstractNumId w:val="1"/>
   </w:num>
-  <w:num w:numId="8">
+  <w:num w:numId="8" w16cid:durableId="918714075">
     <w:abstractNumId w:val="3"/>
   </w:num>
-  <w:num w:numId="9">
+  <w:num w:numId="9" w16cid:durableId="2145154974">
     <w:abstractNumId w:val="0"/>
   </w:num>
-  <w:num w:numId="10">
+  <w:num w:numId="10" w16cid:durableId="13919460">
     <w:abstractNumId w:val="8"/>
   </w:num>
-  <w:num w:numId="11">
+  <w:num w:numId="11" w16cid:durableId="136384832">
     <w:abstractNumId w:val="13"/>
   </w:num>
-  <w:num w:numId="12">
+  <w:num w:numId="12" w16cid:durableId="238368503">
     <w:abstractNumId w:val="10"/>
   </w:num>
-  <w:num w:numId="13">
+  <w:num w:numId="13" w16cid:durableId="200478379">
     <w:abstractNumId w:val="14"/>
   </w:num>
-  <w:num w:numId="14">
+  <w:num w:numId="14" w16cid:durableId="734857976">
     <w:abstractNumId w:val="9"/>
   </w:num>
-  <w:num w:numId="15">
+  <w:num w:numId="15" w16cid:durableId="300114725">
     <w:abstractNumId w:val="7"/>
   </w:num>
 </w:numbering>
 </file>
 
 <file path=word/styles.xml><?xml version="1.0" encoding="utf-8"?>
-<w:styles xmlns:mc="http://schemas.openxmlformats.org/markup-compatibility/2006" xmlns:r="http://schemas.openxmlformats.org/officeDocument/2006/relationships" xmlns:w="http://schemas.openxmlformats.org/wordprocessingml/2006/main" xmlns:w14="http://schemas.microsoft.com/office/word/2010/wordml" xmlns:w15="http://schemas.microsoft.com/office/word/2012/wordml" xmlns:w16cid="http://schemas.microsoft.com/office/word/2016/wordml/cid" xmlns:w16se="http://schemas.microsoft.com/office/word/2015/wordml/symex" mc:Ignorable="w14 w15 w16se w16cid">
+<w:styles xmlns:mc="http://schemas.openxmlformats.org/markup-compatibility/2006" xmlns:r="http://schemas.openxmlformats.org/officeDocument/2006/relationships" xmlns:w="http://schemas.openxmlformats.org/wordprocessingml/2006/main" xmlns:w14="http://schemas.microsoft.com/office/word/2010/wordml" xmlns:w15="http://schemas.microsoft.com/office/word/2012/wordml" xmlns:w16cex="http://schemas.microsoft.com/office/word/2018/wordml/cex" xmlns:w16cid="http://schemas.microsoft.com/office/word/2016/wordml/cid" xmlns:w16="http://schemas.microsoft.com/office/word/2018/wordml" xmlns:w16du="http://schemas.microsoft.com/office/word/2023/wordml/word16du" xmlns:w16sdtdh="http://schemas.microsoft.com/office/word/2020/wordml/sdtdatahash" xmlns:w16sdtfl="http://schemas.microsoft.com/office/word/2024/wordml/sdtformatlock" xmlns:w16se="http://schemas.microsoft.com/office/word/2015/wordml/symex" mc:Ignorable="w14 w15 w16se w16cid w16 w16cex w16sdtdh w16sdtfl w16du">
   <w:docDefaults>
     <w:rPrDefault>
       <w:rPr>
@@ -7383,7 +6755,7 @@
       </w:pPr>
     </w:pPrDefault>
   </w:docDefaults>
-  <w:latentStyles w:defLockedState="0" w:defUIPriority="99" w:defSemiHidden="0" w:defUnhideWhenUsed="0" w:defQFormat="0" w:count="375">
+  <w:latentStyles w:defLockedState="0" w:defUIPriority="99" w:defSemiHidden="0" w:defUnhideWhenUsed="0" w:defQFormat="0" w:count="376">
     <w:lsdException w:name="Normal" w:uiPriority="0" w:qFormat="1"/>
     <w:lsdException w:name="heading 1" w:uiPriority="9" w:qFormat="1"/>
     <w:lsdException w:name="heading 2" w:semiHidden="1" w:uiPriority="9" w:unhideWhenUsed="1" w:qFormat="1"/>
@@ -7759,6 +7131,7 @@
     <w:lsdException w:name="Smart Hyperlink" w:semiHidden="1" w:unhideWhenUsed="1"/>
     <w:lsdException w:name="Hashtag" w:semiHidden="1" w:unhideWhenUsed="1"/>
     <w:lsdException w:name="Unresolved Mention" w:semiHidden="1" w:unhideWhenUsed="1"/>
+    <w:lsdException w:name="Smart Link" w:semiHidden="1" w:unhideWhenUsed="1"/>
   </w:latentStyles>
   <w:style w:type="paragraph" w:default="1" w:styleId="Normal">
     <w:name w:val="Normal"/>

</xml_diff>